<commit_message>
Use narrow margins (0.5in) on Word doc exports
Updates the docx builder to apply Word's "Narrow" margin preset and
matches the HTML @page rule to 0.5in so a direct HTML print yields the
same layout.
</commit_message>
<xml_diff>
--- a/exports/trestle-brief-executive.docx
+++ b/exports/trestle-brief-executive.docx
@@ -166,14 +166,14 @@
         <w:tblLook w:firstColumn="1" w:firstRow="1" w:lastColumn="0" w:lastRow="0" w:noHBand="0" w:noVBand="1" w:val="04A0"/>
       </w:tblPr>
       <w:tblGrid>
-        <w:gridCol w:w="2880"/>
-        <w:gridCol w:w="2880"/>
-        <w:gridCol w:w="2880"/>
+        <w:gridCol w:w="3600"/>
+        <w:gridCol w:w="3600"/>
+        <w:gridCol w:w="3600"/>
       </w:tblGrid>
       <w:tr>
         <w:tc>
           <w:tcPr>
-            <w:tcW w:type="dxa" w:w="2880"/>
+            <w:tcW w:type="dxa" w:w="3600"/>
           </w:tcPr>
           <w:p>
             <w:r>
@@ -183,7 +183,7 @@
         </w:tc>
         <w:tc>
           <w:tcPr>
-            <w:tcW w:type="dxa" w:w="2880"/>
+            <w:tcW w:type="dxa" w:w="3600"/>
           </w:tcPr>
           <w:p>
             <w:r>
@@ -193,7 +193,7 @@
         </w:tc>
         <w:tc>
           <w:tcPr>
-            <w:tcW w:type="dxa" w:w="2880"/>
+            <w:tcW w:type="dxa" w:w="3600"/>
           </w:tcPr>
           <w:p>
             <w:r>
@@ -205,7 +205,7 @@
       <w:tr>
         <w:tc>
           <w:tcPr>
-            <w:tcW w:type="dxa" w:w="2880"/>
+            <w:tcW w:type="dxa" w:w="3600"/>
           </w:tcPr>
           <w:p>
             <w:r>
@@ -215,7 +215,7 @@
         </w:tc>
         <w:tc>
           <w:tcPr>
-            <w:tcW w:type="dxa" w:w="2880"/>
+            <w:tcW w:type="dxa" w:w="3600"/>
           </w:tcPr>
           <w:p>
             <w:r>
@@ -225,7 +225,7 @@
         </w:tc>
         <w:tc>
           <w:tcPr>
-            <w:tcW w:type="dxa" w:w="2880"/>
+            <w:tcW w:type="dxa" w:w="3600"/>
           </w:tcPr>
           <w:p>
             <w:r>
@@ -237,7 +237,7 @@
       <w:tr>
         <w:tc>
           <w:tcPr>
-            <w:tcW w:type="dxa" w:w="2880"/>
+            <w:tcW w:type="dxa" w:w="3600"/>
           </w:tcPr>
           <w:p>
             <w:r>
@@ -247,7 +247,7 @@
         </w:tc>
         <w:tc>
           <w:tcPr>
-            <w:tcW w:type="dxa" w:w="2880"/>
+            <w:tcW w:type="dxa" w:w="3600"/>
           </w:tcPr>
           <w:p>
             <w:r>
@@ -257,7 +257,7 @@
         </w:tc>
         <w:tc>
           <w:tcPr>
-            <w:tcW w:type="dxa" w:w="2880"/>
+            <w:tcW w:type="dxa" w:w="3600"/>
           </w:tcPr>
           <w:p>
             <w:r>
@@ -269,7 +269,7 @@
       <w:tr>
         <w:tc>
           <w:tcPr>
-            <w:tcW w:type="dxa" w:w="2880"/>
+            <w:tcW w:type="dxa" w:w="3600"/>
           </w:tcPr>
           <w:p>
             <w:r>
@@ -279,7 +279,7 @@
         </w:tc>
         <w:tc>
           <w:tcPr>
-            <w:tcW w:type="dxa" w:w="2880"/>
+            <w:tcW w:type="dxa" w:w="3600"/>
           </w:tcPr>
           <w:p>
             <w:r>
@@ -289,7 +289,7 @@
         </w:tc>
         <w:tc>
           <w:tcPr>
-            <w:tcW w:type="dxa" w:w="2880"/>
+            <w:tcW w:type="dxa" w:w="3600"/>
           </w:tcPr>
           <w:p>
             <w:r>
@@ -316,14 +316,14 @@
         <w:tblLook w:firstColumn="1" w:firstRow="1" w:lastColumn="0" w:lastRow="0" w:noHBand="0" w:noVBand="1" w:val="04A0"/>
       </w:tblPr>
       <w:tblGrid>
-        <w:gridCol w:w="2880"/>
-        <w:gridCol w:w="2880"/>
-        <w:gridCol w:w="2880"/>
+        <w:gridCol w:w="3600"/>
+        <w:gridCol w:w="3600"/>
+        <w:gridCol w:w="3600"/>
       </w:tblGrid>
       <w:tr>
         <w:tc>
           <w:tcPr>
-            <w:tcW w:type="dxa" w:w="2880"/>
+            <w:tcW w:type="dxa" w:w="3600"/>
           </w:tcPr>
           <w:p>
             <w:r>
@@ -333,7 +333,7 @@
         </w:tc>
         <w:tc>
           <w:tcPr>
-            <w:tcW w:type="dxa" w:w="2880"/>
+            <w:tcW w:type="dxa" w:w="3600"/>
           </w:tcPr>
           <w:p>
             <w:r>
@@ -343,7 +343,7 @@
         </w:tc>
         <w:tc>
           <w:tcPr>
-            <w:tcW w:type="dxa" w:w="2880"/>
+            <w:tcW w:type="dxa" w:w="3600"/>
           </w:tcPr>
           <w:p>
             <w:r>
@@ -355,7 +355,7 @@
       <w:tr>
         <w:tc>
           <w:tcPr>
-            <w:tcW w:type="dxa" w:w="2880"/>
+            <w:tcW w:type="dxa" w:w="3600"/>
           </w:tcPr>
           <w:p>
             <w:r>
@@ -365,7 +365,7 @@
         </w:tc>
         <w:tc>
           <w:tcPr>
-            <w:tcW w:type="dxa" w:w="2880"/>
+            <w:tcW w:type="dxa" w:w="3600"/>
           </w:tcPr>
           <w:p>
             <w:r>
@@ -375,7 +375,7 @@
         </w:tc>
         <w:tc>
           <w:tcPr>
-            <w:tcW w:type="dxa" w:w="2880"/>
+            <w:tcW w:type="dxa" w:w="3600"/>
           </w:tcPr>
           <w:p>
             <w:r>
@@ -387,7 +387,7 @@
       <w:tr>
         <w:tc>
           <w:tcPr>
-            <w:tcW w:type="dxa" w:w="2880"/>
+            <w:tcW w:type="dxa" w:w="3600"/>
           </w:tcPr>
           <w:p>
             <w:r>
@@ -397,7 +397,7 @@
         </w:tc>
         <w:tc>
           <w:tcPr>
-            <w:tcW w:type="dxa" w:w="2880"/>
+            <w:tcW w:type="dxa" w:w="3600"/>
           </w:tcPr>
           <w:p>
             <w:r>
@@ -407,7 +407,7 @@
         </w:tc>
         <w:tc>
           <w:tcPr>
-            <w:tcW w:type="dxa" w:w="2880"/>
+            <w:tcW w:type="dxa" w:w="3600"/>
           </w:tcPr>
           <w:p>
             <w:r>
@@ -419,7 +419,7 @@
       <w:tr>
         <w:tc>
           <w:tcPr>
-            <w:tcW w:type="dxa" w:w="2880"/>
+            <w:tcW w:type="dxa" w:w="3600"/>
           </w:tcPr>
           <w:p>
             <w:r>
@@ -429,7 +429,7 @@
         </w:tc>
         <w:tc>
           <w:tcPr>
-            <w:tcW w:type="dxa" w:w="2880"/>
+            <w:tcW w:type="dxa" w:w="3600"/>
           </w:tcPr>
           <w:p>
             <w:r>
@@ -439,7 +439,7 @@
         </w:tc>
         <w:tc>
           <w:tcPr>
-            <w:tcW w:type="dxa" w:w="2880"/>
+            <w:tcW w:type="dxa" w:w="3600"/>
           </w:tcPr>
           <w:p>
             <w:r>
@@ -451,7 +451,7 @@
       <w:tr>
         <w:tc>
           <w:tcPr>
-            <w:tcW w:type="dxa" w:w="2880"/>
+            <w:tcW w:type="dxa" w:w="3600"/>
           </w:tcPr>
           <w:p>
             <w:r>
@@ -461,7 +461,7 @@
         </w:tc>
         <w:tc>
           <w:tcPr>
-            <w:tcW w:type="dxa" w:w="2880"/>
+            <w:tcW w:type="dxa" w:w="3600"/>
           </w:tcPr>
           <w:p>
             <w:r>
@@ -471,7 +471,7 @@
         </w:tc>
         <w:tc>
           <w:tcPr>
-            <w:tcW w:type="dxa" w:w="2880"/>
+            <w:tcW w:type="dxa" w:w="3600"/>
           </w:tcPr>
           <w:p>
             <w:r>
@@ -483,7 +483,7 @@
       <w:tr>
         <w:tc>
           <w:tcPr>
-            <w:tcW w:type="dxa" w:w="2880"/>
+            <w:tcW w:type="dxa" w:w="3600"/>
           </w:tcPr>
           <w:p>
             <w:r>
@@ -493,7 +493,7 @@
         </w:tc>
         <w:tc>
           <w:tcPr>
-            <w:tcW w:type="dxa" w:w="2880"/>
+            <w:tcW w:type="dxa" w:w="3600"/>
           </w:tcPr>
           <w:p>
             <w:r>
@@ -503,7 +503,7 @@
         </w:tc>
         <w:tc>
           <w:tcPr>
-            <w:tcW w:type="dxa" w:w="2880"/>
+            <w:tcW w:type="dxa" w:w="3600"/>
           </w:tcPr>
           <w:p>
             <w:r>
@@ -515,7 +515,7 @@
       <w:tr>
         <w:tc>
           <w:tcPr>
-            <w:tcW w:type="dxa" w:w="2880"/>
+            <w:tcW w:type="dxa" w:w="3600"/>
           </w:tcPr>
           <w:p>
             <w:r>
@@ -525,7 +525,7 @@
         </w:tc>
         <w:tc>
           <w:tcPr>
-            <w:tcW w:type="dxa" w:w="2880"/>
+            <w:tcW w:type="dxa" w:w="3600"/>
           </w:tcPr>
           <w:p>
             <w:r>
@@ -535,7 +535,7 @@
         </w:tc>
         <w:tc>
           <w:tcPr>
-            <w:tcW w:type="dxa" w:w="2880"/>
+            <w:tcW w:type="dxa" w:w="3600"/>
           </w:tcPr>
           <w:p>
             <w:r>
@@ -547,7 +547,7 @@
       <w:tr>
         <w:tc>
           <w:tcPr>
-            <w:tcW w:type="dxa" w:w="2880"/>
+            <w:tcW w:type="dxa" w:w="3600"/>
           </w:tcPr>
           <w:p>
             <w:r>
@@ -557,7 +557,7 @@
         </w:tc>
         <w:tc>
           <w:tcPr>
-            <w:tcW w:type="dxa" w:w="2880"/>
+            <w:tcW w:type="dxa" w:w="3600"/>
           </w:tcPr>
           <w:p>
             <w:r>
@@ -567,7 +567,7 @@
         </w:tc>
         <w:tc>
           <w:tcPr>
-            <w:tcW w:type="dxa" w:w="2880"/>
+            <w:tcW w:type="dxa" w:w="3600"/>
           </w:tcPr>
           <w:p>
             <w:r>
@@ -642,13 +642,13 @@
         <w:tblLook w:firstColumn="1" w:firstRow="1" w:lastColumn="0" w:lastRow="0" w:noHBand="0" w:noVBand="1" w:val="04A0"/>
       </w:tblPr>
       <w:tblGrid>
-        <w:gridCol w:w="4320"/>
-        <w:gridCol w:w="4320"/>
+        <w:gridCol w:w="5400"/>
+        <w:gridCol w:w="5400"/>
       </w:tblGrid>
       <w:tr>
         <w:tc>
           <w:tcPr>
-            <w:tcW w:type="dxa" w:w="4320"/>
+            <w:tcW w:type="dxa" w:w="5400"/>
           </w:tcPr>
           <w:p>
             <w:r>
@@ -658,7 +658,7 @@
         </w:tc>
         <w:tc>
           <w:tcPr>
-            <w:tcW w:type="dxa" w:w="4320"/>
+            <w:tcW w:type="dxa" w:w="5400"/>
           </w:tcPr>
           <w:p>
             <w:r>
@@ -670,7 +670,7 @@
       <w:tr>
         <w:tc>
           <w:tcPr>
-            <w:tcW w:type="dxa" w:w="4320"/>
+            <w:tcW w:type="dxa" w:w="5400"/>
           </w:tcPr>
           <w:p>
             <w:r>
@@ -680,7 +680,7 @@
         </w:tc>
         <w:tc>
           <w:tcPr>
-            <w:tcW w:type="dxa" w:w="4320"/>
+            <w:tcW w:type="dxa" w:w="5400"/>
           </w:tcPr>
           <w:p>
             <w:r>
@@ -692,7 +692,7 @@
       <w:tr>
         <w:tc>
           <w:tcPr>
-            <w:tcW w:type="dxa" w:w="4320"/>
+            <w:tcW w:type="dxa" w:w="5400"/>
           </w:tcPr>
           <w:p>
             <w:r>
@@ -702,7 +702,7 @@
         </w:tc>
         <w:tc>
           <w:tcPr>
-            <w:tcW w:type="dxa" w:w="4320"/>
+            <w:tcW w:type="dxa" w:w="5400"/>
           </w:tcPr>
           <w:p>
             <w:r>
@@ -714,7 +714,7 @@
       <w:tr>
         <w:tc>
           <w:tcPr>
-            <w:tcW w:type="dxa" w:w="4320"/>
+            <w:tcW w:type="dxa" w:w="5400"/>
           </w:tcPr>
           <w:p>
             <w:r>
@@ -724,7 +724,7 @@
         </w:tc>
         <w:tc>
           <w:tcPr>
-            <w:tcW w:type="dxa" w:w="4320"/>
+            <w:tcW w:type="dxa" w:w="5400"/>
           </w:tcPr>
           <w:p>
             <w:r>
@@ -736,7 +736,7 @@
       <w:tr>
         <w:tc>
           <w:tcPr>
-            <w:tcW w:type="dxa" w:w="4320"/>
+            <w:tcW w:type="dxa" w:w="5400"/>
           </w:tcPr>
           <w:p>
             <w:r>
@@ -746,7 +746,7 @@
         </w:tc>
         <w:tc>
           <w:tcPr>
-            <w:tcW w:type="dxa" w:w="4320"/>
+            <w:tcW w:type="dxa" w:w="5400"/>
           </w:tcPr>
           <w:p>
             <w:r>
@@ -758,7 +758,7 @@
       <w:tr>
         <w:tc>
           <w:tcPr>
-            <w:tcW w:type="dxa" w:w="4320"/>
+            <w:tcW w:type="dxa" w:w="5400"/>
           </w:tcPr>
           <w:p>
             <w:r>
@@ -768,7 +768,7 @@
         </w:tc>
         <w:tc>
           <w:tcPr>
-            <w:tcW w:type="dxa" w:w="4320"/>
+            <w:tcW w:type="dxa" w:w="5400"/>
           </w:tcPr>
           <w:p>
             <w:r>
@@ -780,7 +780,7 @@
       <w:tr>
         <w:tc>
           <w:tcPr>
-            <w:tcW w:type="dxa" w:w="4320"/>
+            <w:tcW w:type="dxa" w:w="5400"/>
           </w:tcPr>
           <w:p>
             <w:r>
@@ -790,7 +790,7 @@
         </w:tc>
         <w:tc>
           <w:tcPr>
-            <w:tcW w:type="dxa" w:w="4320"/>
+            <w:tcW w:type="dxa" w:w="5400"/>
           </w:tcPr>
           <w:p>
             <w:r>
@@ -1500,13 +1500,13 @@
         <w:tblLook w:firstColumn="1" w:firstRow="1" w:lastColumn="0" w:lastRow="0" w:noHBand="0" w:noVBand="1" w:val="04A0"/>
       </w:tblPr>
       <w:tblGrid>
-        <w:gridCol w:w="4320"/>
-        <w:gridCol w:w="4320"/>
+        <w:gridCol w:w="5400"/>
+        <w:gridCol w:w="5400"/>
       </w:tblGrid>
       <w:tr>
         <w:tc>
           <w:tcPr>
-            <w:tcW w:type="dxa" w:w="4320"/>
+            <w:tcW w:type="dxa" w:w="5400"/>
           </w:tcPr>
           <w:p>
             <w:r>
@@ -1516,7 +1516,7 @@
         </w:tc>
         <w:tc>
           <w:tcPr>
-            <w:tcW w:type="dxa" w:w="4320"/>
+            <w:tcW w:type="dxa" w:w="5400"/>
           </w:tcPr>
           <w:p>
             <w:r>
@@ -1528,7 +1528,7 @@
       <w:tr>
         <w:tc>
           <w:tcPr>
-            <w:tcW w:type="dxa" w:w="4320"/>
+            <w:tcW w:type="dxa" w:w="5400"/>
           </w:tcPr>
           <w:p>
             <w:r>
@@ -1538,7 +1538,7 @@
         </w:tc>
         <w:tc>
           <w:tcPr>
-            <w:tcW w:type="dxa" w:w="4320"/>
+            <w:tcW w:type="dxa" w:w="5400"/>
           </w:tcPr>
           <w:p>
             <w:r>
@@ -1550,7 +1550,7 @@
       <w:tr>
         <w:tc>
           <w:tcPr>
-            <w:tcW w:type="dxa" w:w="4320"/>
+            <w:tcW w:type="dxa" w:w="5400"/>
           </w:tcPr>
           <w:p>
             <w:r>
@@ -1560,7 +1560,7 @@
         </w:tc>
         <w:tc>
           <w:tcPr>
-            <w:tcW w:type="dxa" w:w="4320"/>
+            <w:tcW w:type="dxa" w:w="5400"/>
           </w:tcPr>
           <w:p>
             <w:r>
@@ -1572,7 +1572,7 @@
       <w:tr>
         <w:tc>
           <w:tcPr>
-            <w:tcW w:type="dxa" w:w="4320"/>
+            <w:tcW w:type="dxa" w:w="5400"/>
           </w:tcPr>
           <w:p>
             <w:r>
@@ -1582,7 +1582,7 @@
         </w:tc>
         <w:tc>
           <w:tcPr>
-            <w:tcW w:type="dxa" w:w="4320"/>
+            <w:tcW w:type="dxa" w:w="5400"/>
           </w:tcPr>
           <w:p>
             <w:r>
@@ -1846,7 +1846,7 @@
     </w:p>
     <w:sectPr>
       <w:pgSz w:w="12240" w:h="15840"/>
-      <w:pgMar w:top="1440" w:right="1800" w:bottom="1440" w:left="1800" w:header="720" w:footer="720" w:gutter="0"/>
+      <w:pgMar w:top="720" w:right="720" w:bottom="720" w:left="720" w:header="720" w:footer="720" w:gutter="0"/>
       <w:cols w:space="720"/>
       <w:docGrid w:linePitch="360"/>
     </w:sectPr>

</xml_diff>